<commit_message>
Add PWA exports reminders and performance upgrades
</commit_message>
<xml_diff>
--- a/docs/功能模块说明.docx
+++ b/docs/功能模块说明.docx
@@ -16,6 +16,11 @@
       </w:pPr>
       <w:r>
         <w:t>功能模块说明</w:t>
+      </w:r>
+    </w:p>
+    <w:p>
+      <w:r>
+        <w:t>版本：v3.1</w:t>
       </w:r>
     </w:p>
     <w:p>
@@ -218,7 +223,46 @@
         <w:pStyle w:val="Heading2"/>
       </w:pPr>
       <w:r>
-        <w:t>16. 数据库主要数据表</w:t>
+        <w:t>16. PWA 移动端模块</w:t>
+      </w:r>
+    </w:p>
+    <w:p>
+      <w:r>
+        <w:t>支持添加到主屏幕、离线查看缓存数据和用户级缓存隔离；在 localhost 或 HTTPS 环境下体验最佳。</w:t>
+      </w:r>
+    </w:p>
+    <w:p>
+      <w:pPr>
+        <w:pStyle w:val="Heading2"/>
+      </w:pPr>
+      <w:r>
+        <w:t>17. 报表导出模块</w:t>
+      </w:r>
+    </w:p>
+    <w:p>
+      <w:r>
+        <w:t>统计报表、薄弱分析和复习计划支持导出 Word 与 PDF。</w:t>
+      </w:r>
+    </w:p>
+    <w:p>
+      <w:pPr>
+        <w:pStyle w:val="Heading2"/>
+      </w:pPr>
+      <w:r>
+        <w:t>18. 性能优化模块</w:t>
+      </w:r>
+    </w:p>
+    <w:p>
+      <w:r>
+        <w:t>错题库分页、首页轻量查询、SQLite 索引和 AI 流式输出。</w:t>
+      </w:r>
+    </w:p>
+    <w:p>
+      <w:pPr>
+        <w:pStyle w:val="Heading2"/>
+      </w:pPr>
+      <w:r>
+        <w:t>19. 数据库主要数据表</w:t>
       </w:r>
     </w:p>
     <w:tbl>
@@ -545,7 +589,7 @@
         <w:pStyle w:val="Heading2"/>
       </w:pPr>
       <w:r>
-        <w:t>17. 演示数据</w:t>
+        <w:t>20. 演示数据</w:t>
       </w:r>
     </w:p>
     <w:p>

</xml_diff>

<commit_message>
Align documentation with current implementation
</commit_message>
<xml_diff>
--- a/docs/功能模块说明.docx
+++ b/docs/功能模块说明.docx
@@ -20,7 +20,17 @@
     </w:p>
     <w:p>
       <w:r>
-        <w:t>版本：v3.1</w:t>
+        <w:t>版本：v3.2</w:t>
+      </w:r>
+    </w:p>
+    <w:p>
+      <w:r>
+        <w:t>更新日期：2026-09-24</w:t>
+      </w:r>
+    </w:p>
+    <w:p>
+      <w:r>
+        <w:t>实现基线：以当前代码为准，共 13 张数据表、66 个路由路径（78 个 URL/方法绑定）。</w:t>
       </w:r>
     </w:p>
     <w:p>
@@ -124,7 +134,7 @@
     </w:p>
     <w:p>
       <w:r>
-        <w:t>薄弱指数由错题数量、累计错误次数、时间衰减和近 7 天重复错误加权计算，最终换算为 0～10 分，并提供 30 天趋势和复习优先级。</w:t>
+        <w:t>薄弱指数先按当前候选范围内的最高错题数、最高累计错误次数、最高时间衰减值和最高近 7 天错误次数归一化，再按 0.4、0.3、0.2、0.1 加权并乘以 10，得到 0 到 10 的相对分数。没有复习记录时，使用错题创建时间估算时间衰减。该模块同时提供 30 天趋势和复习优先级。</w:t>
       </w:r>
     </w:p>
     <w:p>
@@ -263,6 +273,11 @@
       </w:pPr>
       <w:r>
         <w:t>19. 数据库主要数据表</w:t>
+      </w:r>
+    </w:p>
+    <w:p>
+      <w:r>
+        <w:t>当前代码共创建 13 张数据表：</w:t>
       </w:r>
     </w:p>
     <w:tbl>
@@ -585,6 +600,11 @@
       </w:tr>
     </w:tbl>
     <w:p>
+      <w:r>
+        <w:t>questions.deleted_at 是软删除标记。字段为空表示正常错题，非空表示已进入回收站；当前版本不自动按时间清理回收站。</w:t>
+      </w:r>
+    </w:p>
+    <w:p>
       <w:pPr>
         <w:pStyle w:val="Heading2"/>
       </w:pPr>
@@ -595,6 +615,19 @@
     <w:p>
       <w:r>
         <w:t>运行 python tools/seed_demo.py 可生成演示账号 demo / demo123，以及 3 个学科、17 个知识点、12 道错题、30 天复习记录、复习计划、知识库内容、学习资源和知识溯源导图。</w:t>
+      </w:r>
+    </w:p>
+    <w:p>
+      <w:pPr>
+        <w:pStyle w:val="Heading2"/>
+      </w:pPr>
+      <w:r>
+        <w:t>21. 实现边界与已知限制</w:t>
+      </w:r>
+    </w:p>
+    <w:p>
+      <w:r>
+        <w:t>OCR 依赖本机 PaddleOCR 和 PaddlePaddle；大模型功能依赖用户配置的 API Key。PWA 完整安装和系统通知需要 localhost 或 HTTPS，浏览器通知只在页面打开时检查。SQLite 适合单机个人使用，不适合多机或高并发部署。上传接口尚未统一增加扩展名白名单、文件内容校验和请求体大小限制，部署到公网前应补充这些保护。</w:t>
       </w:r>
     </w:p>
     <w:sectPr>

</xml_diff>

<commit_message>
Remove nonessential project artifacts
</commit_message>
<xml_diff>
--- a/docs/功能模块说明.docx
+++ b/docs/功能模块说明.docx
@@ -609,20 +609,7 @@
         <w:pStyle w:val="Heading2"/>
       </w:pPr>
       <w:r>
-        <w:t>20. 演示数据</w:t>
-      </w:r>
-    </w:p>
-    <w:p>
-      <w:r>
-        <w:t>运行 python tools/seed_demo.py 可生成演示账号 demo / demo123，以及 3 个学科、17 个知识点、12 道错题、30 天复习记录、复习计划、知识库内容、学习资源和知识溯源导图。</w:t>
-      </w:r>
-    </w:p>
-    <w:p>
-      <w:pPr>
-        <w:pStyle w:val="Heading2"/>
-      </w:pPr>
-      <w:r>
-        <w:t>21. 实现边界与已知限制</w:t>
+        <w:t>20. 实现边界与已知限制</w:t>
       </w:r>
     </w:p>
     <w:p>

</xml_diff>

<commit_message>
Harden uploads and OCR settings
Enforce upload extensions, file signatures, per-user storage, login checks and a request size limit. Honor ocr_enabled, clean failed OCR files, isolate the weak-index test from real data, and sync the Markdown and Word documentation.
</commit_message>
<xml_diff>
--- a/docs/功能模块说明.docx
+++ b/docs/功能模块说明.docx
@@ -82,7 +82,7 @@
     </w:p>
     <w:p>
       <w:r>
-        <w:t>支持手动录入、拍照 OCR、图片上传以及 PDF/Word 试卷导入。导入时自动分题并预览，用户确认后批量入库。</w:t>
+        <w:t>支持手动录入、拍照 OCR、图片上传以及 PDF/Word 试卷导入。文档导入支持 PDF 与 DOCX，旧版 .doc 需先另存为 .docx。导入时自动分题并预览，用户确认后批量入库。</w:t>
       </w:r>
     </w:p>
     <w:p>
@@ -134,7 +134,7 @@
     </w:p>
     <w:p>
       <w:r>
-        <w:t>薄弱指数先按当前候选范围内的最高错题数、最高累计错误次数、最高时间衰减值和最高近 7 天错误次数归一化，再按 0.4、0.3、0.2、0.1 加权并乘以 10，得到 0 到 10 的相对分数。没有复习记录时，使用错题创建时间估算时间衰减。该模块同时提供 30 天趋势和复习优先级。</w:t>
+        <w:t>薄弱指数对错题数、错误事件次数、时间衰减值和近 7 天错误次数分别做饱和归一化 x/(x+k)（参考规模为固定常量），再按 0.4、0.3、0.2、0.1 加权并乘以 10，得到 0 到 10 的分数。参考规模固定使得新增错题不会改变其他知识点的分数，指数可跨时间比较。错误事件统一口径：已复习错题只计“复习仍错”，从未复习的错题以创建时间计一次。该模块同时提供 30 天趋势和复习优先级。</w:t>
       </w:r>
     </w:p>
     <w:p>
@@ -225,7 +225,7 @@
     </w:p>
     <w:p>
       <w:r>
-        <w:t>支持大模型 API Key、模型名称、知识点推荐阈值，以及 OCR 语言、方向识别和置信度阈值配置。</w:t>
+        <w:t>支持大模型 API Key、模型名称、知识点推荐阈值，以及 OCR 启用开关、语言、方向识别和置信度阈值配置。关闭 OCR 后，拍照只保存图片，不调用识别。</w:t>
       </w:r>
     </w:p>
     <w:p>
@@ -614,7 +614,7 @@
     </w:p>
     <w:p>
       <w:r>
-        <w:t>OCR 依赖本机 PaddleOCR 和 PaddlePaddle；大模型功能依赖用户配置的 API Key。PWA 完整安装和系统通知需要 localhost 或 HTTPS，浏览器通知只在页面打开时检查。SQLite 适合单机个人使用，不适合多机或高并发部署。上传接口尚未统一增加扩展名白名单、文件内容校验和请求体大小限制，部署到公网前应补充这些保护。</w:t>
+        <w:t>OCR 依赖本机 PaddleOCR 和 PaddlePaddle；大模型功能依赖用户配置的 API Key。PWA 完整安装和系统通知需要 localhost 或 HTTPS，浏览器通知只在页面打开时检查。SQLite 适合单机个人使用，不适合多机或高并发部署。上传接口已限制扩展名和文件头特征，并设置单个请求体 32 MB 上限；图片、附件和 OCR 文件按用户分目录存放，访问上传文件需要先登录。文件头校验只能拦截扩展名与内容明显不符的文件，不能替代完整的病毒扫描和深度格式解析。会话 Cookie 已启用 SameSite=Lax 与 HttpOnly；若部署到公网，仍建议启用 HTTPS（设置环境变量 WRONGBOOK_HTTPS=1 打开 Secure Cookie）。</w:t>
       </w:r>
     </w:p>
     <w:sectPr>

</xml_diff>